<commit_message>
docs: update internal content Vortex → Traverse, VTX → TRV
</commit_message>
<xml_diff>
--- a/Traverse_Tokenomics_TRV.docx
+++ b/Traverse_Tokenomics_TRV.docx
@@ -25,7 +25,7 @@
           <w:sz w:val="64"/>
           <w:szCs w:val="64"/>
         </w:rPr>
-        <w:t xml:space="preserve">VORTEX PROTOCOL</w:t>
+        <w:t>TRAVERSE PROTOCOL</w:t>
       </w:r>
     </w:p>
     <w:p>
@@ -40,7 +40,7 @@
           <w:sz w:val="40"/>
           <w:szCs w:val="40"/>
         </w:rPr>
-        <w:t xml:space="preserve">VTX Token — Tokenomics Completo</w:t>
+        <w:t>TRV Token — Tokenomics Completo</w:t>
       </w:r>
     </w:p>
     <w:p>
@@ -147,7 +147,7 @@
           <w:sz w:val="36"/>
           <w:szCs w:val="36"/>
         </w:rPr>
-        <w:t xml:space="preserve">1. Visao Geral do Token VTX</w:t>
+        <w:t>1. Visao Geral do Token TRV</w:t>
       </w:r>
     </w:p>
     <w:p>
@@ -165,7 +165,7 @@
           <w:sz w:val="20"/>
           <w:szCs w:val="20"/>
         </w:rPr>
-        <w:t xml:space="preserve">O VTX e o token nativo do Vortex Protocol, um agregador de liquidez e roteador de ordens descentralizado operando nas redes Base e Arbitrum. O design do token foi pensado para alinhar incentivos entre usuarios, solvers, provedores de liquidez e detentores de longo prazo, garantindo sustentabilidade economica e descentralizacao progressiva do protocolo.</w:t>
+        <w:t>O TRV e o token nativo do Traverse Protocol, um agregador de liquidez e roteador de ordens descentralizado operando nas redes Base e Arbitrum. O design do token foi pensado para alinhar incentivos entre usuarios, solvers, provedores de liquidez e detentores de longo prazo, garantindo sustentabilidade economica e descentralizacao progressiva do protocolo.</w:t>
       </w:r>
     </w:p>
     <w:p>
@@ -276,7 +276,7 @@
                 <w:sz w:val="18"/>
                 <w:szCs w:val="18"/>
               </w:rPr>
-              <w:t xml:space="preserve">Vortex Token</w:t>
+              <w:t>Traverse Token</w:t>
             </w:r>
           </w:p>
         </w:tc>
@@ -364,7 +364,7 @@
                 <w:sz w:val="18"/>
                 <w:szCs w:val="18"/>
               </w:rPr>
-              <w:t xml:space="preserve">VTX</w:t>
+              <w:t>TRV</w:t>
             </w:r>
           </w:p>
         </w:tc>
@@ -628,7 +628,7 @@
                 <w:sz w:val="18"/>
                 <w:szCs w:val="18"/>
               </w:rPr>
-              <w:t xml:space="preserve">1,000,000,000 VTX (1 bilhao) — fixo, imutavel</w:t>
+              <w:t>1,000,000,000 TRV (1 bilhao) — fixo, imutavel</w:t>
             </w:r>
           </w:p>
         </w:tc>
@@ -716,7 +716,7 @@
                 <w:sz w:val="18"/>
                 <w:szCs w:val="18"/>
               </w:rPr>
-              <w:t xml:space="preserve">120,000,000 VTX (~12% — liquidez + airdrop + seed parcial)</w:t>
+              <w:t>120,000,000 TRV (~12% — liquidez + airdrop + seed parcial)</w:t>
             </w:r>
           </w:p>
         </w:tc>
@@ -1203,7 +1203,7 @@
           <w:sz w:val="20"/>
           <w:szCs w:val="20"/>
         </w:rPr>
-        <w:t xml:space="preserve">O VTX foi projetado com quatro principios fundamentais que garantem integridade economica e confianca dos participantes:</w:t>
+        <w:t>O TRV foi projetado com quatro principios fundamentais que garantem integridade economica e confianca dos participantes:</w:t>
       </w:r>
     </w:p>
     <w:p>
@@ -1373,7 +1373,7 @@
                 <w:sz w:val="18"/>
                 <w:szCs w:val="18"/>
               </w:rPr>
-              <w:t xml:space="preserve">O supply de 1 bilhao de VTX e permanente. Nao ha funcao de mint() acessivel apos o deploy. Nenhuma entidade — incluindo a equipe fundadora — pode criar novos tokens.</w:t>
+              <w:t>O supply de 1 bilhao de TRV e permanente. Nao ha funcao de mint() acessivel apos o deploy. Nenhuma entidade — incluindo a equipe fundadora — pode criar novos tokens.</w:t>
             </w:r>
           </w:p>
         </w:tc>
@@ -1635,7 +1635,7 @@
           <w:sz w:val="20"/>
           <w:szCs w:val="20"/>
         </w:rPr>
-        <w:t xml:space="preserve">O supply total de 1,000,000,000 VTX e distribuido entre sete categorias, cada uma com parametros de cliff e vesting distintos. A maior alocacao (35%) e destinada a comunidade e incentivos de protocolo, refletindo o compromisso com a descentralizacao progressiva.</w:t>
+        <w:t>O supply total de 1,000,000,000 TRV e distribuido entre sete categorias, cada uma com parametros de cliff e vesting distintos. A maior alocacao (35%) e destinada a comunidade e incentivos de protocolo, refletindo o compromisso com a descentralizacao progressiva.</w:t>
       </w:r>
     </w:p>
     <w:p>
@@ -1771,7 +1771,7 @@
                 <w:sz w:val="18"/>
                 <w:szCs w:val="18"/>
               </w:rPr>
-              <w:t xml:space="preserve">VTX</w:t>
+              <w:t>TRV</w:t>
             </w:r>
           </w:p>
         </w:tc>
@@ -3303,7 +3303,7 @@
           <w:sz w:val="20"/>
           <w:szCs w:val="20"/>
         </w:rPr>
-        <w:t xml:space="preserve">A tabela abaixo apresenta o desbloqueio mensal de tokens VTX por categoria ao longo dos primeiros 24 meses (2 anos). Todos os valores estao em milhoes de VTX (M). O circulating supply projetado representa os tokens tecnicamente disponiveis para circulacao, excluindo tokens ainda em vesting.</w:t>
+        <w:t>A tabela abaixo apresenta o desbloqueio mensal de tokens TRV por categoria ao longo dos primeiros 24 meses (2 anos). Todos os valores estao em milhoes de TRV (M). O circulating supply projetado representa os tokens tecnicamente disponiveis para circulacao, excluindo tokens ainda em vesting.</w:t>
       </w:r>
     </w:p>
     <w:p>
@@ -3330,7 +3330,7 @@
           <w:sz w:val="20"/>
           <w:szCs w:val="20"/>
         </w:rPr>
-        <w:t xml:space="preserve">Nota: O Tesouro (200M VTX) e exibido como disponivel no Mes 1 pois fica sob controle de governanca desde o lancamento, mas seu uso e restrito a propostas aprovadas. A Liquidez Inicial e desbloqueada no Mes 13 (apos lock de 12 meses nos LP tokens).</w:t>
+        <w:t>Nota: O Tesouro (200M TRV) e exibido como disponivel no Mes 1 pois fica sob controle de governanca desde o lancamento, mas seu uso e restrito a propostas aprovadas. A Liquidez Inicial e desbloqueada no Mes 13 (apos lock de 12 meses nos LP tokens).</w:t>
       </w:r>
     </w:p>
     <w:p>
@@ -12219,7 +12219,7 @@
           <w:sz w:val="36"/>
           <w:szCs w:val="36"/>
         </w:rPr>
-        <w:t xml:space="preserve">4. Utilidade do Token VTX — 4 Pilares</w:t>
+        <w:t>4. Utilidade do Token TRV — 4 Pilares</w:t>
       </w:r>
     </w:p>
     <w:p>
@@ -12237,7 +12237,7 @@
           <w:sz w:val="20"/>
           <w:szCs w:val="20"/>
         </w:rPr>
-        <w:t xml:space="preserve">O VTX possui quatro casos de uso fundamentais que criam demanda organica e alinham os incentivos de todos os participantes do protocolo Vortex.</w:t>
+        <w:t>O TRV possui quatro casos de uso fundamentais que criam demanda organica e alinham os incentivos de todos os participantes do protocolo Traverse.</w:t>
       </w:r>
     </w:p>
     <w:p>
@@ -12281,7 +12281,7 @@
           <w:sz w:val="20"/>
           <w:szCs w:val="20"/>
         </w:rPr>
-        <w:t xml:space="preserve">Solvers sao entidades que competem para executar ordens roteadas pelo protocolo Vortex. Para participar como solver, e necessario depositar VTX como colateral, criando um mecanismo de accountability economico.</w:t>
+        <w:t>Solvers sao entidades que competem para executar ordens roteadas pelo protocolo Traverse. Para participar como solver, e necessario depositar TRV como colateral, criando um mecanismo de accountability economico.</w:t>
       </w:r>
     </w:p>
     <w:p>
@@ -12451,7 +12451,7 @@
                 <w:sz w:val="18"/>
                 <w:szCs w:val="18"/>
               </w:rPr>
-              <w:t xml:space="preserve">10,000 VTX por solver registrado</w:t>
+              <w:t>10,000 TRV por solver registrado</w:t>
             </w:r>
           </w:p>
         </w:tc>
@@ -12813,7 +12813,7 @@
           <w:sz w:val="20"/>
           <w:szCs w:val="20"/>
         </w:rPr>
-        <w:t xml:space="preserve">O VTX confere poder de governanca proporcional ao saldo detido, utilizando snapshots no bloco da criacao de cada proposta para prevenir ataques de compra e voto.</w:t>
+        <w:t>O TRV confere poder de governanca proporcional ao saldo detido, utilizando snapshots no bloco da criacao de cada proposta para prevenir ataques de compra e voto.</w:t>
       </w:r>
     </w:p>
     <w:p>
@@ -12983,7 +12983,7 @@
                 <w:sz w:val="18"/>
                 <w:szCs w:val="18"/>
               </w:rPr>
-              <w:t xml:space="preserve">1 VTX = 1 voto (snapshot no bloco de criacao da proposta)</w:t>
+              <w:t>1 TRV = 1 voto (snapshot no bloco de criacao da proposta)</w:t>
             </w:r>
           </w:p>
         </w:tc>
@@ -13055,7 +13055,7 @@
                 <w:sz w:val="18"/>
                 <w:szCs w:val="18"/>
               </w:rPr>
-              <w:t xml:space="preserve">1,000,000 VTX (0.1% do supply total)</w:t>
+              <w:t>1,000,000 TRV (0.1% do supply total)</w:t>
             </w:r>
           </w:p>
         </w:tc>
@@ -13127,7 +13127,7 @@
                 <w:sz w:val="18"/>
                 <w:szCs w:val="18"/>
               </w:rPr>
-              <w:t xml:space="preserve">40,000,000 VTX (4% do supply total)</w:t>
+              <w:t>40,000,000 TRV (4% do supply total)</w:t>
             </w:r>
           </w:p>
         </w:tc>
@@ -13492,7 +13492,7 @@
           <w:sz w:val="20"/>
           <w:szCs w:val="20"/>
         </w:rPr>
-        <w:t xml:space="preserve">Usuarios que detiverem VTX em sua carteira (sem necessidade de staking) recebem descontos progressivos na fee de 0.05% do protocolo. O desconto e calculado automaticamente pelo contrato no momento da execucao da ordem.</w:t>
+        <w:t>Usuarios que detiverem TRV em sua carteira (sem necessidade de staking) recebem descontos progressivos na fee de 0.05% do protocolo. O desconto e calculado automaticamente pelo contrato no momento da execucao da ordem.</w:t>
       </w:r>
     </w:p>
     <w:p>
@@ -13593,7 +13593,7 @@
                 <w:sz w:val="18"/>
                 <w:szCs w:val="18"/>
               </w:rPr>
-              <w:t xml:space="preserve">VTX Requerido</w:t>
+              <w:t>TRV Requerido</w:t>
             </w:r>
           </w:p>
         </w:tc>
@@ -13770,7 +13770,7 @@
                 <w:sz w:val="18"/>
                 <w:szCs w:val="18"/>
               </w:rPr>
-              <w:t xml:space="preserve">0 VTX</w:t>
+              <w:t>0 TRV</w:t>
             </w:r>
           </w:p>
         </w:tc>
@@ -13875,7 +13875,7 @@
                 <w:sz w:val="18"/>
                 <w:szCs w:val="18"/>
               </w:rPr>
-              <w:t xml:space="preserve">Usuario sem VTX (padrao)</w:t>
+              <w:t>Usuario sem TRV (padrao)</w:t>
             </w:r>
           </w:p>
         </w:tc>
@@ -13947,7 +13947,7 @@
                 <w:sz w:val="18"/>
                 <w:szCs w:val="18"/>
               </w:rPr>
-              <w:t xml:space="preserve">1,000 VTX</w:t>
+              <w:t>1,000 TRV</w:t>
             </w:r>
           </w:p>
         </w:tc>
@@ -14124,7 +14124,7 @@
                 <w:sz w:val="18"/>
                 <w:szCs w:val="18"/>
               </w:rPr>
-              <w:t xml:space="preserve">10,000 VTX</w:t>
+              <w:t>10,000 TRV</w:t>
             </w:r>
           </w:p>
         </w:tc>
@@ -14301,7 +14301,7 @@
                 <w:sz w:val="18"/>
                 <w:szCs w:val="18"/>
               </w:rPr>
-              <w:t xml:space="preserve">100,000 VTX</w:t>
+              <w:t>100,000 TRV</w:t>
             </w:r>
           </w:p>
         </w:tc>
@@ -14436,7 +14436,7 @@
           <w:sz w:val="20"/>
           <w:szCs w:val="20"/>
         </w:rPr>
-        <w:t xml:space="preserve">O saldo de VTX e verificado em tempo real no bloco da transacao. Nao e necessario fazer staking — basta deter os tokens na carteira que executa a ordem.</w:t>
+        <w:t>O saldo de TRV e verificado em tempo real no bloco da transacao. Nao e necessario fazer staking — basta deter os tokens na carteira que executa a ordem.</w:t>
       </w:r>
     </w:p>
     <w:p>
@@ -14480,7 +14480,7 @@
           <w:sz w:val="20"/>
           <w:szCs w:val="20"/>
         </w:rPr>
-        <w:t xml:space="preserve">70% de todas as fees coletadas pelo protocolo sao distribuidas proporcionalmente aos detentores de VTX em staking. A distribuicao ocorre por epoch (diaria ou semanal, definivel por governanca) em stablecoin (USDC) ou ETH — sem necessidade de claim — direto para o contrato de staking.</w:t>
+        <w:t>70% de todas as fees coletadas pelo protocolo sao distribuidas proporcionalmente aos detentores de TRV em staking. A distribuicao ocorre por epoch (diaria ou semanal, definivel por governanca) em stablecoin (USDC) ou ETH — sem necessidade de claim — direto para o contrato de staking.</w:t>
       </w:r>
     </w:p>
     <w:p>
@@ -15088,7 +15088,7 @@
           <w:sz w:val="20"/>
           <w:szCs w:val="20"/>
         </w:rPr>
-        <w:t xml:space="preserve">O protocolo Vortex gera receita de forma proporcional ao volume roteado. A taxa de 0.05% e competitiva com os principais agregadores e roteadores do mercado DeFi. Abaixo, tres cenarios de volume com respectivas projecoes de receita e APY estimado para stakers.</w:t>
+        <w:t>O protocolo Traverse gera receita de forma proporcional ao volume roteado. A taxa de 0.05% e competitiva com os principais agregadores e roteadores do mercado DeFi. Abaixo, tres cenarios de volume com respectivas projecoes de receita e APY estimado para stakers.</w:t>
       </w:r>
     </w:p>
     <w:p>
@@ -15115,7 +15115,7 @@
           <w:sz w:val="20"/>
           <w:szCs w:val="20"/>
         </w:rPr>
-        <w:t xml:space="preserve">Pressupostos: APY calculado com base em 20% do supply total em staking (200,000,000 VTX). Para fins ilustrativos, assume-se preco de VTX = $0.10 (valor hipotetico). APY varia com preco do token e percentual em staking.</w:t>
+        <w:t>Pressupostos: APY calculado com base em 20% do supply total em staking (200,000,000 TRV). Para fins ilustrativos, assume-se preco de TRV = $0.10 (valor hipotetico). APY varia com preco do token e percentual em staking.</w:t>
       </w:r>
     </w:p>
     <w:p>
@@ -15882,7 +15882,7 @@
           <w:sz w:val="20"/>
           <w:szCs w:val="20"/>
         </w:rPr>
-        <w:t xml:space="preserve">(*) APY baseado em 200,000,000 VTX em staking (20% do supply) a $0.10/VTX = $20,000,000 em valor staked. APY = (Receita anual para stakers) / (Valor total staked). Valores sao estimativas ilustrativas — nao constituem garantia ou promessa de retorno. APY real depende de preco do VTX, volume roteado e percentual de supply em staking.</w:t>
+        <w:t>(*) APY baseado em 200,000,000 TRV em staking (20% do supply) a $0.10/TRV = $20,000,000 em valor staked. APY = (Receita anual para stakers) / (Valor total staked). Valores sao estimativas ilustrativas — nao constituem garantia ou promessa de retorno. APY real depende de preco do TRV, volume roteado e percentual de supply em staking.</w:t>
       </w:r>
     </w:p>
     <w:p>
@@ -16106,7 +16106,7 @@
                 <w:sz w:val="18"/>
                 <w:szCs w:val="18"/>
               </w:rPr>
-              <w:t xml:space="preserve">Stakers VTX</w:t>
+              <w:t>Stakers TRV</w:t>
             </w:r>
           </w:p>
         </w:tc>
@@ -16541,7 +16541,7 @@
           <w:sz w:val="20"/>
           <w:szCs w:val="20"/>
         </w:rPr>
-        <w:t xml:space="preserve">O protocolo Vortex inclui uma funcionalidade opcional de burn de tokens que pode ser ativada por votacao de governanca. Nao esta ativa no lancamento inicial, mas o contrato suporta sua ativacao sem necessidade de upgrade.</w:t>
+        <w:t>O protocolo Traverse inclui uma funcionalidade opcional de burn de tokens que pode ser ativada por votacao de governanca. Nao esta ativa no lancamento inicial, mas o contrato suporta sua ativacao sem necessidade de upgrade.</w:t>
       </w:r>
     </w:p>
     <w:p>
@@ -16783,7 +16783,7 @@
                 <w:sz w:val="18"/>
                 <w:szCs w:val="18"/>
               </w:rPr>
-              <w:t xml:space="preserve">Proporcional ao uso: mais volume = mais burn. Cenario otimista ($2B/mes): ~$10,000/mes em VTX queimado</w:t>
+              <w:t>Proporcional ao uso: mais volume = mais burn. Cenario otimista ($2B/mes): ~$10,000/mes em TRV queimado</w:t>
             </w:r>
           </w:p>
         </w:tc>
@@ -17089,7 +17089,7 @@
           <w:sz w:val="20"/>
           <w:szCs w:val="20"/>
         </w:rPr>
-        <w:t xml:space="preserve">No lancamento, 70,000,000 VTX (7% do supply) serao aportados como liquidez inicial em pools descentralizados, garantindo profundidade de mercado desde o primeiro dia.</w:t>
+        <w:t>No lancamento, 70,000,000 TRV (7% do supply) serao aportados como liquidez inicial em pools descentralizados, garantindo profundidade de mercado desde o primeiro dia.</w:t>
       </w:r>
     </w:p>
     <w:p>
@@ -17259,7 +17259,7 @@
                 <w:sz w:val="18"/>
                 <w:szCs w:val="18"/>
               </w:rPr>
-              <w:t xml:space="preserve">70,000,000 VTX + equivalente em ETH e/ou USDC (ratio definido proximos ao lancamento)</w:t>
+              <w:t>70,000,000 TRV + equivalente em ETH e/ou USDC (ratio definido proximos ao lancamento)</w:t>
             </w:r>
           </w:p>
         </w:tc>
@@ -17817,7 +17817,7 @@
                 <w:sz w:val="18"/>
                 <w:szCs w:val="18"/>
               </w:rPr>
-              <w:t xml:space="preserve">TGE — Pool VTX/ETH e VTX/USDC em Uniswap v3 e Aerodrome. LP tokens bloqueados.</w:t>
+              <w:t>TGE — Pool TRV/ETH e TRV/USDC em Uniswap v3 e Aerodrome. LP tokens bloqueados.</w:t>
             </w:r>
           </w:p>
         </w:tc>
@@ -17924,7 +17924,7 @@
                 <w:sz w:val="18"/>
                 <w:szCs w:val="18"/>
               </w:rPr>
-              <w:t xml:space="preserve">Expansao para Arbitrum via bridge oficial. Pool VTX/ETH em Camelot.</w:t>
+              <w:t>Expansao para Arbitrum via bridge oficial. Pool TRV/ETH em Camelot.</w:t>
             </w:r>
           </w:p>
         </w:tc>
@@ -18184,7 +18184,7 @@
           <w:sz w:val="20"/>
           <w:szCs w:val="20"/>
         </w:rPr>
-        <w:t xml:space="preserve">O Tesouro do Protocolo conta com 200,000,000 VTX (20% do supply), alem de acumular 20% de todas as fees geradas. Todo uso dos fundos do tesouro requer aprovacao via governanca on-chain.</w:t>
+        <w:t>O Tesouro do Protocolo conta com 200,000,000 TRV (20% do supply), alem de acumular 20% de todas as fees geradas. Todo uso dos fundos do tesouro requer aprovacao via governanca on-chain.</w:t>
       </w:r>
     </w:p>
     <w:p>
@@ -18515,7 +18515,7 @@
                 <w:sz w:val="18"/>
                 <w:szCs w:val="18"/>
               </w:rPr>
-              <w:t xml:space="preserve">Qualquer holder com 1M VTX pode propor alocacao. Votacao por 5 dias + timelock 48h.</w:t>
+              <w:t>Qualquer holder com 1M TRV pode propor alocacao. Votacao por 5 dias + timelock 48h.</w:t>
             </w:r>
           </w:p>
         </w:tc>
@@ -18848,7 +18848,7 @@
                 <w:sz w:val="18"/>
                 <w:szCs w:val="18"/>
               </w:rPr>
-              <w:t xml:space="preserve">Programa de grants para desenvolvedores que constroem sobre o Vortex Protocol (integradores, ferramentas, analytics)</w:t>
+              <w:t>Programa de grants para desenvolvedores que constroem sobre o Traverse Protocol (integradores, ferramentas, analytics)</w:t>
             </w:r>
           </w:p>
         </w:tc>
@@ -19322,7 +19322,7 @@
           <w:sz w:val="20"/>
           <w:szCs w:val="20"/>
         </w:rPr>
-        <w:t xml:space="preserve">Todo protocolo DeFi carrega riscos inerentes. A seguir, identificamos os principais riscos economicos do VTX e as mitigacoes implementadas ou planejadas.</w:t>
+        <w:t>Todo protocolo DeFi carrega riscos inerentes. A seguir, identificamos os principais riscos economicos do TRV e as mitigacoes implementadas ou planejadas.</w:t>
       </w:r>
     </w:p>
     <w:p>
@@ -19777,7 +19777,7 @@
                 <w:sz w:val="18"/>
                 <w:szCs w:val="18"/>
               </w:rPr>
-              <w:t xml:space="preserve">Programa de incentivos de 350M VTX para bootstrapping. Parcerias estrategicas com agregadores. Fee competitiva.</w:t>
+              <w:t>Programa de incentivos de 350M TRV para bootstrapping. Parcerias estrategicas com agregadores. Fee competitiva.</w:t>
             </w:r>
           </w:p>
         </w:tc>
@@ -20098,7 +20098,7 @@
                 <w:sz w:val="18"/>
                 <w:szCs w:val="18"/>
               </w:rPr>
-              <w:t xml:space="preserve">VTX e token de utilidade (fee discount, governance, staking). Sem caracteristicas de security tradicional. Aconselhamento juridico continuo.</w:t>
+              <w:t>TRV e token de utilidade (fee discount, governance, staking). Sem caracteristicas de security tradicional. Aconselhamento juridico continuo.</w:t>
             </w:r>
           </w:p>
         </w:tc>
@@ -20251,7 +20251,7 @@
           <w:sz w:val="20"/>
           <w:szCs w:val="20"/>
         </w:rPr>
-        <w:t xml:space="preserve">O VTX foi projetado tendo como referencia os modelos economicos de tres protocolos DeFi consolidados: GMX (perpetuals), Uniswap (DEX/AMM) e CoW Protocol (solver-based DEX). Cada um oferece licoes valiosas sobre design de tokenomics sustentavel.</w:t>
+        <w:t>O TRV foi projetado tendo como referencia os modelos economicos de tres protocolos DeFi consolidados: GMX (perpetuals), Uniswap (DEX/AMM) e CoW Protocol (solver-based DEX). Cada um oferece licoes valiosas sobre design de tokenomics sustentavel.</w:t>
       </w:r>
     </w:p>
     <w:p>
@@ -20457,7 +20457,7 @@
                 <w:sz w:val="18"/>
                 <w:szCs w:val="18"/>
               </w:rPr>
-              <w:t xml:space="preserve">Vortex (VTX)</w:t>
+              <w:t>Traverse (TRV)</w:t>
             </w:r>
           </w:p>
         </w:tc>
@@ -20811,7 +20811,7 @@
                 <w:sz w:val="18"/>
                 <w:szCs w:val="18"/>
               </w:rPr>
-              <w:t xml:space="preserve">70% stakers VTX</w:t>
+              <w:t>70% stakers TRV</w:t>
             </w:r>
           </w:p>
         </w:tc>
@@ -20988,7 +20988,7 @@
                 <w:sz w:val="18"/>
                 <w:szCs w:val="18"/>
               </w:rPr>
-              <w:t xml:space="preserve">1 VTX = 1 voto, quorum 4%</w:t>
+              <w:t>1 TRV = 1 voto, quorum 4%</w:t>
             </w:r>
           </w:p>
         </w:tc>
@@ -21696,7 +21696,7 @@
                 <w:sz w:val="18"/>
                 <w:szCs w:val="18"/>
               </w:rPr>
-              <w:t xml:space="preserve">Tier 0-3 por saldo VTX</w:t>
+              <w:t>Tier 0-3 por saldo TRV</w:t>
             </w:r>
           </w:p>
         </w:tc>
@@ -21902,7 +21902,7 @@
           <w:sz w:val="28"/>
           <w:szCs w:val="28"/>
         </w:rPr>
-        <w:t xml:space="preserve">10.1 Diferenciais do VTX em Relacao aos Competidores</w:t>
+        <w:t>10.1 Diferenciais do TRV em Relacao aos Competidores</w:t>
       </w:r>
     </w:p>
     <w:p>
@@ -22072,7 +22072,7 @@
                 <w:sz w:val="18"/>
                 <w:szCs w:val="18"/>
               </w:rPr>
-              <w:t xml:space="preserve">CoW Protocol tem solvers competitivos mas sem stake obrigatorio. VTX adiciona colateral economico, criando accountability muito maior e MEV resistance superior.</w:t>
+              <w:t>CoW Protocol tem solvers competitivos mas sem stake obrigatorio. TRV adiciona colateral economico, criando accountability muito maior e MEV resistance superior.</w:t>
             </w:r>
           </w:p>
         </w:tc>
@@ -22144,7 +22144,7 @@
                 <w:sz w:val="18"/>
                 <w:szCs w:val="18"/>
               </w:rPr>
-              <w:t xml:space="preserve">Uniswap nao distribui fees para detentores de UNI. VTX combina revenue sharing (70%) com desconto de fee por tier, criando demanda organica em dois vetores.</w:t>
+              <w:t>Uniswap nao distribui fees para detentores de UNI. TRV combina revenue sharing (70%) com desconto de fee por tier, criando demanda organica em dois vetores.</w:t>
             </w:r>
           </w:p>
         </w:tc>
@@ -22216,7 +22216,7 @@
                 <w:sz w:val="18"/>
                 <w:szCs w:val="18"/>
               </w:rPr>
-              <w:t xml:space="preserve">GMX emite esGMX (inflacionario). VTX tem supply fixo de 1B sem qualquer mecanismo de emissao futura, preservando valor para holders de longo prazo.</w:t>
+              <w:t>GMX emite esGMX (inflacionario). TRV tem supply fixo de 1B sem qualquer mecanismo de emissao futura, preservando valor para holders de longo prazo.</w:t>
             </w:r>
           </w:p>
         </w:tc>
@@ -22288,7 +22288,7 @@
                 <w:sz w:val="18"/>
                 <w:szCs w:val="18"/>
               </w:rPr>
-              <w:t xml:space="preserve">Quorum de 4% (40M VTX) previne propostas de nicho passarem com poucos votos. Threshold de 1M VTX para propor e acessivel mas filtra spam de governanca.</w:t>
+              <w:t>Quorum de 4% (40M TRV) previne propostas de nicho passarem com poucos votos. Threshold de 1M TRV para propor e acessivel mas filtra spam de governanca.</w:t>
             </w:r>
           </w:p>
         </w:tc>
@@ -22334,7 +22334,7 @@
           <w:sz w:val="20"/>
           <w:szCs w:val="20"/>
         </w:rPr>
-        <w:t xml:space="preserve">Este documento e fornecido exclusivamente para fins informativos e educacionais sobre o design economico do Vortex Protocol. As projecoes e estimativas contidas neste documento sao hipoteticas e baseadas em suposicoes que podem nao se materializar.</w:t>
+        <w:t>Este documento e fornecido exclusivamente para fins informativos e educacionais sobre o design economico do Traverse Protocol. As projecoes e estimativas contidas neste documento sao hipoteticas e baseadas em suposicoes que podem nao se materializar.</w:t>
       </w:r>
     </w:p>
     <w:p>
@@ -22472,7 +22472,7 @@
           <w:sz w:val="20"/>
           <w:szCs w:val="20"/>
         </w:rPr>
-        <w:t xml:space="preserve">Criptoativos envolvem riscos substanciais incluindo, mas nao limitado a: perda total do capital investido, alta volatilidade de preco, riscos de smart contract, riscos regulatorios e riscos de liquidez. Qualquer decisao de participar no protocolo Vortex deve ser tomada apos consulta com assessores financeiros, juridicos e fiscais qualificados.</w:t>
+        <w:t>Criptoativos envolvem riscos substanciais incluindo, mas nao limitado a: perda total do capital investido, alta volatilidade de preco, riscos de smart contract, riscos regulatorios e riscos de liquidez. Qualquer decisao de participar no protocolo Traverse deve ser tomada apos consulta com assessores financeiros, juridicos e fiscais qualificados.</w:t>
       </w:r>
     </w:p>
     <w:p>
@@ -22524,7 +22524,7 @@
           <w:sz w:val="16"/>
           <w:szCs w:val="16"/>
         </w:rPr>
-        <w:t xml:space="preserve">Vortex Protocol | VTX Tokenomics v1.0 | Junho 2026 | Confidencial</w:t>
+        <w:t>Traverse Protocol | TRV Tokenomics v1.0 | Junho 2026 | Confidencial</w:t>
       </w:r>
     </w:p>
     <w:sectPr>
@@ -22617,7 +22617,7 @@
         <w:sz w:val="16"/>
         <w:szCs w:val="16"/>
       </w:rPr>
-      <w:t xml:space="preserve">  |  Vortex Protocol VTX Tokenomics v1.0  |  Junho 2026</w:t>
+      <w:t xml:space="preserve">  |  Traverse Protocol TRV Tokenomics v1.0  |  Junho 2026</w:t>
     </w:r>
   </w:p>
 </w:ftr>
@@ -22676,7 +22676,7 @@
         <w:sz w:val="16"/>
         <w:szCs w:val="16"/>
       </w:rPr>
-      <w:t xml:space="preserve">Vortex Protocol  |  VTX Tokenomics</w:t>
+      <w:t>Traverse Protocol  |  TRV Tokenomics</w:t>
     </w:r>
     <w:r>
       <w:rPr>

</xml_diff>